<commit_message>
Ajusta correção ao Tema 2 (alternativas à privação da liberdade)
Co-Authored-By: Claude Opus 5.5 <noreply@anthropic.com>
Claude-Session: https://claude.ai/code/session_01GBJJsaxwwNeWKmAaw5c74A
</commit_message>
<xml_diff>
--- a/correcoes/correcao_redacao_criminalidade.docx
+++ b/correcoes/correcao_redacao_criminalidade.docx
@@ -30,7 +30,7 @@
         <w:rPr>
           <w:i/>
         </w:rPr>
-        <w:t>Os desafios do combate à criminalidade no Brasil e o papel do sistema prisional.</w:t>
+        <w:t>A necessidade de repensar formas de coibir os crimes na sociedade brasileira, utilizando alternativas à privação da liberdade.</w:t>
       </w:r>
     </w:p>
     <w:tbl>
@@ -133,7 +133,7 @@
                 <w:b/>
                 <w:sz w:val="19"/>
               </w:rPr>
-              <w:t>21,0</w:t>
+              <w:t>20,0</w:t>
             </w:r>
           </w:p>
         </w:tc>
@@ -186,7 +186,7 @@
                 <w:b/>
                 <w:sz w:val="19"/>
               </w:rPr>
-              <w:t>21,0</w:t>
+              <w:t>17,0</w:t>
             </w:r>
           </w:p>
         </w:tc>
@@ -347,7 +347,7 @@
                 <w:b/>
                 <w:sz w:val="19"/>
               </w:rPr>
-              <w:t>73,0</w:t>
+              <w:t>68,0</w:t>
             </w:r>
           </w:p>
         </w:tc>
@@ -400,7 +400,25 @@
         <w:t>precariedade prisional, facções criminosas e segurança pública</w:t>
       </w:r>
       <w:r>
-        <w:t xml:space="preserve">. Entretanto, para uma prova de concurso, ainda há pontos importantes a corrigir: </w:t>
+        <w:t xml:space="preserve">. Entretanto, para uma prova de concurso, ainda há pontos importantes a corrigir, sobretudo o </w:t>
+      </w:r>
+      <w:r>
+        <w:rPr>
+          <w:b/>
+        </w:rPr>
+        <w:t>tangenciamento do recorte temático</w:t>
+      </w:r>
+      <w:r>
+        <w:t xml:space="preserve">: o tema pede </w:t>
+      </w:r>
+      <w:r>
+        <w:rPr>
+          <w:b/>
+        </w:rPr>
+        <w:t>alternativas à privação da liberdade</w:t>
+      </w:r>
+      <w:r>
+        <w:t xml:space="preserve">, e o texto não as discute. Também pesam </w:t>
       </w:r>
       <w:r>
         <w:rPr>
@@ -436,7 +454,7 @@
           <w:sz w:val="22"/>
         </w:rPr>
         <w:tab/>
-        <w:t>21,0 / 25,0</w:t>
+        <w:t>20,0 / 25,0</w:t>
       </w:r>
     </w:p>
     <w:p>
@@ -509,16 +527,16 @@
         <w:t>O que tira pontos.</w:t>
       </w:r>
       <w:r>
-        <w:t xml:space="preserve"> A introdução começa falando do </w:t>
+        <w:t xml:space="preserve"> A tese não contempla o </w:t>
       </w:r>
       <w:r>
         <w:rPr>
           <w:b/>
         </w:rPr>
-        <w:t>sistema prisional</w:t>
+        <w:t>recorte do tema</w:t>
       </w:r>
       <w:r>
-        <w:t xml:space="preserve">, mas a tese não menciona o cárcere, que depois aparece “escondido” dentro do D1. Além disso, o </w:t>
+        <w:t xml:space="preserve"> (alternativas à prisão): os eixos anunciados tratam das causas da criminalidade, e não de novas formas de punir. Além disso, o </w:t>
       </w:r>
       <w:r>
         <w:rPr>
@@ -542,7 +560,7 @@
         <w:t>Como melhorar.</w:t>
       </w:r>
       <w:r>
-        <w:t xml:space="preserve"> Alinhar contextualização e tese:</w:t>
+        <w:t xml:space="preserve"> Construir a tese a partir do recorte:</w:t>
       </w:r>
     </w:p>
     <w:p>
@@ -555,7 +573,7 @@
         </w:pBdr>
       </w:pPr>
       <w:r>
-        <w:t>A precariedade do sistema prisional e a ausência de políticas preventivas fortalecem as facções, enquanto a vulnerabilidade social alimenta o recrutamento para o crime.</w:t>
+        <w:t>O encarceramento em massa, longe de reduzir a criminalidade, fortalece as facções e eleva a reincidência; por isso, é necessário ampliar penas alternativas para crimes sem violência ou grave ameaça.</w:t>
       </w:r>
     </w:p>
     <w:p>
@@ -582,7 +600,7 @@
           <w:sz w:val="22"/>
         </w:rPr>
         <w:tab/>
-        <w:t>21,0 / 30,0</w:t>
+        <w:t>17,0 / 30,0</w:t>
       </w:r>
     </w:p>
     <w:p>
@@ -606,10 +624,28 @@
         <w:rPr>
           <w:b/>
         </w:rPr>
-        <w:t>Fidelidade ao tema: boa.</w:t>
+        <w:t>Fidelidade ao tema: parcial (tangenciamento).</w:t>
       </w:r>
       <w:r>
-        <w:t xml:space="preserve"> O texto discute o combate à criminalidade e relaciona causas e consequências.</w:t>
+        <w:t xml:space="preserve"> O texto discute o combate ao crime, mas </w:t>
+      </w:r>
+      <w:r>
+        <w:rPr>
+          <w:b/>
+        </w:rPr>
+        <w:t>em nenhum momento apresenta alternativas à privação da liberdade</w:t>
+      </w:r>
+      <w:r>
+        <w:t xml:space="preserve">, como penas restritivas de direitos, monitoramento eletrônico ou justiça restaurativa. Pior: a proposta final defende “um sistema prisional mais estruturado”, reforçando a prisão em vez de repensá-la. O texto tem um ponto de partida aproveitável (o cárcere fortalece as facções), mas não conclui o raciocínio: </w:t>
+      </w:r>
+      <w:r>
+        <w:rPr>
+          <w:i/>
+        </w:rPr>
+        <w:t>logo, prender menos e punir de outras formas</w:t>
+      </w:r>
+      <w:r>
+        <w:t>.</w:t>
       </w:r>
     </w:p>
     <w:p>
@@ -717,10 +753,51 @@
         <w:rPr>
           <w:b/>
         </w:rPr>
-        <w:t>Lei de Execução Penal (Lei 7.210/84):</w:t>
+        <w:t>Lei 9.714/98 e art. 44 do Código Penal:</w:t>
       </w:r>
       <w:r>
-        <w:t xml:space="preserve"> prevê educação, trabalho e assistência ao preso;</w:t>
+        <w:t xml:space="preserve"> penas restritivas de direitos (prestação de serviços à comunidade, limitação de fim de semana);</w:t>
+      </w:r>
+    </w:p>
+    <w:p>
+      <w:pPr>
+        <w:pStyle w:val="ListBullet"/>
+        <w:spacing w:after="20"/>
+        <w:jc w:val="both"/>
+      </w:pPr>
+      <w:r>
+        <w:rPr>
+          <w:b/>
+        </w:rPr>
+        <w:t>Lei 12.403/2011:</w:t>
+      </w:r>
+      <w:r>
+        <w:t xml:space="preserve"> medidas cautelares diversas da prisão, como o monitoramento eletrônico;</w:t>
+      </w:r>
+    </w:p>
+    <w:p>
+      <w:pPr>
+        <w:pStyle w:val="ListBullet"/>
+        <w:spacing w:after="20"/>
+        <w:jc w:val="both"/>
+      </w:pPr>
+      <w:r>
+        <w:rPr>
+          <w:b/>
+        </w:rPr>
+        <w:t>Acordo de não persecução penal</w:t>
+      </w:r>
+      <w:r>
+        <w:t xml:space="preserve"> (Pacote Anticrime, Lei 13.964/2019) e </w:t>
+      </w:r>
+      <w:r>
+        <w:rPr>
+          <w:b/>
+        </w:rPr>
+        <w:t>justiça restaurativa</w:t>
+      </w:r>
+      <w:r>
+        <w:t xml:space="preserve"> (Resolução CNJ 225/2016);</w:t>
       </w:r>
     </w:p>
     <w:p>
@@ -736,48 +813,7 @@
         <w:t>Dados do Senappen:</w:t>
       </w:r>
       <w:r>
-        <w:t xml:space="preserve"> mais de 800 mil pessoas privadas de liberdade;</w:t>
-      </w:r>
-    </w:p>
-    <w:p>
-      <w:pPr>
-        <w:pStyle w:val="ListBullet"/>
-        <w:spacing w:after="20"/>
-        <w:jc w:val="both"/>
-      </w:pPr>
-      <w:r>
-        <w:rPr>
-          <w:b/>
-        </w:rPr>
-        <w:t>Origem do PCC</w:t>
-      </w:r>
-      <w:r>
-        <w:t xml:space="preserve"> dentro do sistema prisional paulista, nos anos 1990;</w:t>
-      </w:r>
-    </w:p>
-    <w:p>
-      <w:pPr>
-        <w:pStyle w:val="ListBullet"/>
-        <w:spacing w:after="20"/>
-        <w:jc w:val="both"/>
-      </w:pPr>
-      <w:r>
-        <w:rPr>
-          <w:b/>
-        </w:rPr>
-        <w:t>Atlas da Violência (IPEA/FBSP)</w:t>
-      </w:r>
-      <w:r>
-        <w:t xml:space="preserve"> e </w:t>
-      </w:r>
-      <w:r>
-        <w:rPr>
-          <w:b/>
-        </w:rPr>
-        <w:t>art. 144 da CF/88</w:t>
-      </w:r>
-      <w:r>
-        <w:t>.</w:t>
+        <w:t xml:space="preserve"> mais de 800 mil presos, boa parte provisórios ou por crimes sem violência.</w:t>
       </w:r>
     </w:p>
     <w:p>
@@ -872,7 +908,7 @@
         <w:rPr>
           <w:b/>
         </w:rPr>
-        <w:t>cárcere superlotado → ausência do Estado nas unidades → facções assumem o controle → recrutamento de presos → reincidência → mais insegurança.</w:t>
+        <w:t>prisão de autores de crimes leves → contato com facções → recrutamento → reincidência → logo, penas alternativas protegem mais a sociedade.</w:t>
       </w:r>
     </w:p>
     <w:p>
@@ -967,16 +1003,16 @@
         <w:rPr>
           <w:b/>
         </w:rPr>
-        <w:t>O Ministério da Justiça, em parceria com os governos estaduais, deve reestruturar o sistema prisional</w:t>
+        <w:t>O Ministério da Justiça, em parceria com os governos estaduais, deve ampliar a aplicação de penas alternativas</w:t>
       </w:r>
       <w:r>
-        <w:t xml:space="preserve">, por meio da separação de presos por grau de periculosidade e da oferta obrigatória de educação e trabalho, conforme prevê a Lei de Execução Penal, </w:t>
+        <w:t xml:space="preserve">, por meio da expansão das centrais de monitoramento eletrônico e de convênios para prestação de serviços à comunidade, destinados a autores de crimes sem violência ou grave ameaça, </w:t>
       </w:r>
       <w:r>
         <w:rPr>
           <w:b/>
         </w:rPr>
-        <w:t>a fim de reduzir a influência das facções e a reincidência.</w:t>
+        <w:t>a fim de evitar o contato com as facções e reduzir a reincidência.</w:t>
       </w:r>
     </w:p>
     <w:p>
@@ -2073,7 +2109,7 @@
                 <w:b/>
                 <w:sz w:val="19"/>
               </w:rPr>
-              <w:t>Bom</w:t>
+              <w:t>Parcial</w:t>
             </w:r>
           </w:p>
         </w:tc>
@@ -2209,7 +2245,7 @@
                 <w:b/>
                 <w:sz w:val="19"/>
               </w:rPr>
-              <w:t>Bom</w:t>
+              <w:t>Regular</w:t>
             </w:r>
           </w:p>
         </w:tc>
@@ -2429,13 +2465,22 @@
         <w:jc w:val="both"/>
       </w:pPr>
       <w:r>
-        <w:t xml:space="preserve">Seu principal desafio agora não é escrever mais. É </w:t>
+        <w:t xml:space="preserve">Seu principal desafio é </w:t>
       </w:r>
       <w:r>
         <w:rPr>
           <w:b/>
         </w:rPr>
-        <w:t>sustentar melhor o que escreve</w:t>
+        <w:t>ler o tema até o fim</w:t>
+      </w:r>
+      <w:r>
+        <w:t xml:space="preserve">: o recorte “alternativas à privação da liberdade” precisava estar na tese, nos desenvolvimentos e na proposta. Depois disso, </w:t>
+      </w:r>
+      <w:r>
+        <w:rPr>
+          <w:b/>
+        </w:rPr>
+        <w:t>sustente melhor o que escreve</w:t>
       </w:r>
       <w:r>
         <w:t xml:space="preserve">: nunca use o texto motivador como repertório; mantenha </w:t>
@@ -2465,7 +2510,7 @@
         <w:t>O que acontece? → Por que acontece? → O que isso provoca? → Por que isso prejudica a sociedade?</w:t>
       </w:r>
       <w:r>
-        <w:t xml:space="preserve"> Com repertório funcional e esses ajustes, sua redação pode sair da faixa dos 70 e alcançar com segurança </w:t>
+        <w:t xml:space="preserve"> Com repertório funcional e esses ajustes, sua redação pode sair da faixa dos 60 e alcançar com segurança </w:t>
       </w:r>
       <w:r>
         <w:rPr>

</xml_diff>